<commit_message>
Kim12-1-6-Elektrolitik-Hucreler: gorsel alanlarina Shutter onizlemeleri yerlestirildi (2.3 bicimi)
</commit_message>
<xml_diff>
--- a/Kim12-1-6-Elektrolitik-Hucreler.docx
+++ b/Kim12-1-6-Elektrolitik-Hucreler.docx
@@ -39,99 +39,73 @@
         <w:t xml:space="preserve">Akşam eve geldiğinizde telefonunuzu şarja takarsınız (Görsel A). Gün boyunca telefonun içindeki pilde istemli bir indirgenme-yükseltgenme tepkimesi gerçekleşmiş ve kimyasal enerji elektrik enerjisine dönüşmüştür. Şarj sırasında ise pil yeniden kullanılabilir hâle gelir. Önceki konularda galvanik hücrelerde istemli tepkimelerin kendiliğinden gerçekleştiğini ve pozitif bir hücre potansiyeli oluşturduğunu gördünüz. Peki istemli bir tepkimenin tersini gerçekleştirmek mümkün müdür? Doğada yalnızca bileşikleri hâlinde bulunan sodyum, alüminyum gibi aktif metaller ve klor gazı nasıl elde edilir (Görsel B)? Bir tepkimeyi kendiliğinden gerçekleşmediği yönde yürütmek için hangi şartların sağlanması gerekir?</w:t>
       </w:r>
     </w:p>
-    <w:tbl>
-      <w:tblPr>
-        <w:tblW w:w="9000" w:type="dxa"/>
+    <w:p>
+      <w:pPr>
         <w:jc w:val="center"/>
-        <w:tblBorders>
-          <w:top w:val="single" w:sz="8" w:space="0" w:color="7F7F7F"/>
-          <w:left w:val="single" w:sz="8" w:space="0" w:color="7F7F7F"/>
-          <w:bottom w:val="single" w:sz="8" w:space="0" w:color="7F7F7F"/>
-          <w:right w:val="single" w:sz="8" w:space="0" w:color="7F7F7F"/>
-        </w:tblBorders>
-      </w:tblPr>
-      <w:tblGrid>
-        <w:gridCol w:w="9000"/>
-      </w:tblGrid>
-      <w:tr>
-        <w:tc>
-          <w:tcPr>
-            <w:tcW w:w="9000" w:type="dxa"/>
-            <w:shd w:val="clear" w:color="auto" w:fill="EDEDED"/>
-          </w:tcPr>
-          <w:p>
-            <w:pPr>
-              <w:jc w:val="both"/>
-              <w:rPr>
-                <w:rFonts w:ascii="Times New Roman" w:hAnsi="Times New Roman" w:cs="Times New Roman"/>
-                <w:lang w:val="tr-TR"/>
-              </w:rPr>
-            </w:pPr>
-            <w:r>
-              <w:rPr>
-                <w:rFonts w:ascii="Times New Roman" w:hAnsi="Times New Roman" w:cs="Times New Roman"/>
-                <w:lang w:val="tr-TR"/>
-              </w:rPr>
-              <w:t xml:space="preserve">GÖRSEL ALANI (Shutterstock)</w:t>
-            </w:r>
-          </w:p>
-          <w:p>
-            <w:pPr>
-              <w:jc w:val="both"/>
-              <w:rPr>
-                <w:rFonts w:ascii="Times New Roman" w:hAnsi="Times New Roman" w:cs="Times New Roman"/>
-                <w:lang w:val="tr-TR"/>
-              </w:rPr>
-            </w:pPr>
-            <w:r>
-              <w:rPr>
-                <w:rFonts w:ascii="Times New Roman" w:hAnsi="Times New Roman" w:cs="Times New Roman"/>
-                <w:lang w:val="tr-TR"/>
-              </w:rPr>
-              <w:t xml:space="preserve">Tarif: Komodin ya da masa üzerinde kabloyla şarj edilen bir akıllı telefon; ekranda pil doluluk simgesi görünsün; marka ve logo görünmesin.</w:t>
-            </w:r>
-          </w:p>
-          <w:p>
-            <w:pPr>
-              <w:jc w:val="both"/>
-              <w:rPr>
-                <w:rFonts w:ascii="Times New Roman" w:hAnsi="Times New Roman" w:cs="Times New Roman"/>
-                <w:lang w:val="tr-TR"/>
-              </w:rPr>
-            </w:pPr>
-            <w:r>
-              <w:rPr>
-                <w:rFonts w:ascii="Times New Roman" w:hAnsi="Times New Roman" w:cs="Times New Roman"/>
-                <w:lang w:val="tr-TR"/>
-              </w:rPr>
-              <w:t xml:space="preserve">Shutter ID: 2234563227 (fotoğraf) — USB Type-C cable and smartphone charging</w:t>
-            </w:r>
-          </w:p>
-        </w:tc>
-      </w:tr>
-    </w:tbl>
+      </w:pPr>
+      <w:r>
+        <w:drawing>
+          <wp:inline xmlns:a="http://schemas.openxmlformats.org/drawingml/2006/main" xmlns:pic="http://schemas.openxmlformats.org/drawingml/2006/picture">
+            <wp:extent cx="3433242" cy="2520000"/>
+            <wp:docPr id="900012" name="Picture 900012"/>
+            <wp:cNvGraphicFramePr>
+              <a:graphicFrameLocks noChangeAspect="1"/>
+            </wp:cNvGraphicFramePr>
+            <a:graphic>
+              <a:graphicData uri="http://schemas.openxmlformats.org/drawingml/2006/picture">
+                <pic:pic>
+                  <pic:nvPicPr>
+                    <pic:cNvPr id="0" name="2234563227_d.jpg"/>
+                    <pic:cNvPicPr/>
+                  </pic:nvPicPr>
+                  <pic:blipFill>
+                    <a:blip r:embed="rId11"/>
+                    <a:stretch>
+                      <a:fillRect/>
+                    </a:stretch>
+                  </pic:blipFill>
+                  <pic:spPr>
+                    <a:xfrm>
+                      <a:off x="0" y="0"/>
+                      <a:ext cx="3433242" cy="2520000"/>
+                    </a:xfrm>
+                    <a:prstGeom prst="rect"/>
+                  </pic:spPr>
+                </pic:pic>
+              </a:graphicData>
+            </a:graphic>
+          </wp:inline>
+        </w:drawing>
+      </w:r>
+    </w:p>
     <w:p>
       <w:pPr>
-        <w:jc w:val="both"/>
-        <w:rPr>
-          <w:rFonts w:ascii="Times New Roman" w:hAnsi="Times New Roman" w:cs="Times New Roman"/>
-          <w:lang w:val="tr-TR"/>
-        </w:rPr>
-      </w:pPr>
-    </w:p>
-    <w:p>
-      <w:pPr>
         <w:jc w:val="center"/>
-        <w:rPr>
-          <w:rFonts w:ascii="Times New Roman" w:hAnsi="Times New Roman" w:cs="Times New Roman"/>
-          <w:lang w:val="tr-TR"/>
-        </w:rPr>
       </w:pPr>
       <w:r>
         <w:rPr>
           <w:rFonts w:ascii="Times New Roman" w:hAnsi="Times New Roman" w:cs="Times New Roman"/>
           <w:b/>
           <w:bCs/>
+          <w:highlight w:val="yellow"/>
+          <w:lang w:val="tr-TR"/>
+        </w:rPr>
+        <w:t xml:space="preserve">Shutter id: 2234563227</w:t>
+      </w:r>
+    </w:p>
+    <w:p>
+      <w:pPr>
+        <w:jc w:val="center"/>
+        <w:rPr>
+          <w:rFonts w:ascii="Times New Roman" w:hAnsi="Times New Roman" w:cs="Times New Roman"/>
+          <w:lang w:val="tr-TR"/>
+        </w:rPr>
+      </w:pPr>
+      <w:r>
+        <w:rPr>
+          <w:rFonts w:ascii="Times New Roman" w:hAnsi="Times New Roman" w:cs="Times New Roman"/>
+          <w:b/>
+          <w:bCs/>
           <w:lang w:val="tr-TR"/>
         </w:rPr>
         <w:t xml:space="preserve">Görsel A:</w:t>
@@ -144,85 +118,59 @@
         <w:t xml:space="preserve"> Şarj edilen bir akıllı telefon</w:t>
       </w:r>
     </w:p>
-    <w:tbl>
-      <w:tblPr>
-        <w:tblW w:w="9000" w:type="dxa"/>
+    <w:p>
+      <w:pPr>
         <w:jc w:val="center"/>
-        <w:tblBorders>
-          <w:top w:val="single" w:sz="8" w:space="0" w:color="7F7F7F"/>
-          <w:left w:val="single" w:sz="8" w:space="0" w:color="7F7F7F"/>
-          <w:bottom w:val="single" w:sz="8" w:space="0" w:color="7F7F7F"/>
-          <w:right w:val="single" w:sz="8" w:space="0" w:color="7F7F7F"/>
-        </w:tblBorders>
-      </w:tblPr>
-      <w:tblGrid>
-        <w:gridCol w:w="9000"/>
-      </w:tblGrid>
-      <w:tr>
-        <w:tc>
-          <w:tcPr>
-            <w:tcW w:w="9000" w:type="dxa"/>
-            <w:shd w:val="clear" w:color="auto" w:fill="EDEDED"/>
-          </w:tcPr>
-          <w:p>
-            <w:pPr>
-              <w:jc w:val="both"/>
-              <w:rPr>
-                <w:rFonts w:ascii="Times New Roman" w:hAnsi="Times New Roman" w:cs="Times New Roman"/>
-                <w:lang w:val="tr-TR"/>
-              </w:rPr>
-            </w:pPr>
-            <w:r>
-              <w:rPr>
-                <w:rFonts w:ascii="Times New Roman" w:hAnsi="Times New Roman" w:cs="Times New Roman"/>
-                <w:lang w:val="tr-TR"/>
-              </w:rPr>
-              <w:t xml:space="preserve">GÖRSEL ALANI (Shutterstock)</w:t>
-            </w:r>
-          </w:p>
-          <w:p>
-            <w:pPr>
-              <w:jc w:val="both"/>
-              <w:rPr>
-                <w:rFonts w:ascii="Times New Roman" w:hAnsi="Times New Roman" w:cs="Times New Roman"/>
-                <w:lang w:val="tr-TR"/>
-              </w:rPr>
-            </w:pPr>
-            <w:r>
-              <w:rPr>
-                <w:rFonts w:ascii="Times New Roman" w:hAnsi="Times New Roman" w:cs="Times New Roman"/>
-                <w:lang w:val="tr-TR"/>
-              </w:rPr>
-              <w:t xml:space="preserve">Tarif: Bir alüminyum üretim tesisinde sıra hâlinde dizilmiş elektroliz hücreleri (potline); tesis adı veya logo görünmesin.</w:t>
-            </w:r>
-          </w:p>
-          <w:p>
-            <w:pPr>
-              <w:jc w:val="both"/>
-              <w:rPr>
-                <w:rFonts w:ascii="Times New Roman" w:hAnsi="Times New Roman" w:cs="Times New Roman"/>
-                <w:lang w:val="tr-TR"/>
-              </w:rPr>
-            </w:pPr>
-            <w:r>
-              <w:rPr>
-                <w:rFonts w:ascii="Times New Roman" w:hAnsi="Times New Roman" w:cs="Times New Roman"/>
-                <w:lang w:val="tr-TR"/>
-              </w:rPr>
-              <w:t xml:space="preserve">Shutter ID: 1458899561 (fotoğraf) — Electrolysis cells in mineral processing</w:t>
-            </w:r>
-          </w:p>
-        </w:tc>
-      </w:tr>
-    </w:tbl>
+      </w:pPr>
+      <w:r>
+        <w:drawing>
+          <wp:inline xmlns:a="http://schemas.openxmlformats.org/drawingml/2006/main" xmlns:pic="http://schemas.openxmlformats.org/drawingml/2006/picture">
+            <wp:extent cx="3433242" cy="2520000"/>
+            <wp:docPr id="900013" name="Picture 900013"/>
+            <wp:cNvGraphicFramePr>
+              <a:graphicFrameLocks noChangeAspect="1"/>
+            </wp:cNvGraphicFramePr>
+            <a:graphic>
+              <a:graphicData uri="http://schemas.openxmlformats.org/drawingml/2006/picture">
+                <pic:pic>
+                  <pic:nvPicPr>
+                    <pic:cNvPr id="0" name="1458899561_d.jpg"/>
+                    <pic:cNvPicPr/>
+                  </pic:nvPicPr>
+                  <pic:blipFill>
+                    <a:blip r:embed="rId12"/>
+                    <a:stretch>
+                      <a:fillRect/>
+                    </a:stretch>
+                  </pic:blipFill>
+                  <pic:spPr>
+                    <a:xfrm>
+                      <a:off x="0" y="0"/>
+                      <a:ext cx="3433242" cy="2520000"/>
+                    </a:xfrm>
+                    <a:prstGeom prst="rect"/>
+                  </pic:spPr>
+                </pic:pic>
+              </a:graphicData>
+            </a:graphic>
+          </wp:inline>
+        </w:drawing>
+      </w:r>
+    </w:p>
     <w:p>
       <w:pPr>
-        <w:jc w:val="both"/>
-        <w:rPr>
-          <w:rFonts w:ascii="Times New Roman" w:hAnsi="Times New Roman" w:cs="Times New Roman"/>
-          <w:lang w:val="tr-TR"/>
-        </w:rPr>
-      </w:pPr>
+        <w:jc w:val="center"/>
+      </w:pPr>
+      <w:r>
+        <w:rPr>
+          <w:rFonts w:ascii="Times New Roman" w:hAnsi="Times New Roman" w:cs="Times New Roman"/>
+          <w:b/>
+          <w:bCs/>
+          <w:highlight w:val="yellow"/>
+          <w:lang w:val="tr-TR"/>
+        </w:rPr>
+        <w:t xml:space="preserve">Shutter id: 1458899561</w:t>
+      </w:r>
     </w:p>
     <w:p>
       <w:pPr>

</xml_diff>